<commit_message>
Added new Post-UTME portal updates, improvements and bug fixes
</commit_message>
<xml_diff>
--- a/unilag English PostUTME.docx
+++ b/unilag English PostUTME.docx
@@ -22318,10 +22318,697 @@
         <w:t xml:space="preserve"> would have + past participle”. So “Had she studied harder, she would have passed the exam.” Option (b) is correct.</w:t>
       </w:r>
     </w:p>
+    <w:p/>
+    <w:p>
+      <w:r>
+        <w:t>ENGLISH – NEW QUESTIONS FROM unilag-past-questions-and-answers-2.pdf (OAE generated) – QUESTIONS 301 TO 308</w:t>
+      </w:r>
+    </w:p>
+    <w:p/>
+    <w:p>
+      <w:r>
+        <w:t>Question 301</w:t>
+      </w:r>
+    </w:p>
+    <w:p>
+      <w:r>
+        <w:t>Subject: English</w:t>
+      </w:r>
+    </w:p>
+    <w:p>
+      <w:r>
+        <w:t>Year: OAE generated questions</w:t>
+      </w:r>
+    </w:p>
+    <w:p>
+      <w:r>
+        <w:t>Instruction: From the words lettered A to D, choose the word that is most nearly similar in meaning to the underlined word.</w:t>
+      </w:r>
+    </w:p>
+    <w:p>
+      <w:r>
+        <w:t>Sentence: The greatness of the creator of the universe is always inexpressible to many adherents of certain faiths.</w:t>
+      </w:r>
+    </w:p>
+    <w:p>
+      <w:r>
+        <w:t>Options:</w:t>
+      </w:r>
+    </w:p>
+    <w:p>
+      <w:r>
+        <w:t xml:space="preserve">(a) </w:t>
+      </w:r>
+      <w:proofErr w:type="gramStart"/>
+      <w:r>
+        <w:t>inevitable</w:t>
+      </w:r>
+      <w:proofErr w:type="gramEnd"/>
+    </w:p>
+    <w:p>
+      <w:r>
+        <w:t xml:space="preserve">(b) </w:t>
+      </w:r>
+      <w:proofErr w:type="gramStart"/>
+      <w:r>
+        <w:t>wonderful</w:t>
+      </w:r>
+      <w:proofErr w:type="gramEnd"/>
+    </w:p>
+    <w:p>
+      <w:r>
+        <w:t xml:space="preserve">(c) </w:t>
+      </w:r>
+      <w:proofErr w:type="gramStart"/>
+      <w:r>
+        <w:t>ineffable</w:t>
+      </w:r>
+      <w:proofErr w:type="gramEnd"/>
+    </w:p>
+    <w:p>
+      <w:r>
+        <w:t xml:space="preserve">(d) </w:t>
+      </w:r>
+      <w:proofErr w:type="gramStart"/>
+      <w:r>
+        <w:t>unbearable</w:t>
+      </w:r>
+      <w:proofErr w:type="gramEnd"/>
+    </w:p>
+    <w:p>
+      <w:r>
+        <w:t>Correct Answer: (c) ineffable</w:t>
+      </w:r>
+    </w:p>
+    <w:p>
+      <w:r>
+        <w:t>Explanation: “Inexpressible” means too great for words; “ineffable” is the direct synonym. “Inevitable” means unavoidable; “wonderful” means amazing; “unbearable” means intolerable. So (c) is correct.</w:t>
+      </w:r>
+    </w:p>
+    <w:p/>
+    <w:p>
+      <w:r>
+        <w:t>Question 302</w:t>
+      </w:r>
+    </w:p>
+    <w:p>
+      <w:r>
+        <w:t>Subject: English</w:t>
+      </w:r>
+    </w:p>
+    <w:p>
+      <w:r>
+        <w:t>Year: OAE generated questions</w:t>
+      </w:r>
+    </w:p>
+    <w:p>
+      <w:r>
+        <w:t>Instruction: From the words lettered A to D, choose the interpretation that you consider most appropriate for the sentence.</w:t>
+      </w:r>
+    </w:p>
+    <w:p>
+      <w:r>
+        <w:t>Sentence: We made a pile in the business deal.</w:t>
+      </w:r>
+    </w:p>
+    <w:p>
+      <w:r>
+        <w:t>Options:</w:t>
+      </w:r>
+    </w:p>
+    <w:p>
+      <w:r>
+        <w:t xml:space="preserve">(a) </w:t>
+      </w:r>
+      <w:proofErr w:type="gramStart"/>
+      <w:r>
+        <w:t>lost</w:t>
+      </w:r>
+      <w:proofErr w:type="gramEnd"/>
+      <w:r>
+        <w:t xml:space="preserve"> a lot of money</w:t>
+      </w:r>
+    </w:p>
+    <w:p>
+      <w:r>
+        <w:t xml:space="preserve">(b) </w:t>
+      </w:r>
+      <w:proofErr w:type="gramStart"/>
+      <w:r>
+        <w:t>earned</w:t>
+      </w:r>
+      <w:proofErr w:type="gramEnd"/>
+      <w:r>
+        <w:t xml:space="preserve"> a lot of money</w:t>
+      </w:r>
+    </w:p>
+    <w:p>
+      <w:r>
+        <w:t xml:space="preserve">(c) </w:t>
+      </w:r>
+      <w:proofErr w:type="gramStart"/>
+      <w:r>
+        <w:t>broke</w:t>
+      </w:r>
+      <w:proofErr w:type="gramEnd"/>
+      <w:r>
+        <w:t xml:space="preserve"> even</w:t>
+      </w:r>
+    </w:p>
+    <w:p>
+      <w:r>
+        <w:t xml:space="preserve">(d) </w:t>
+      </w:r>
+      <w:proofErr w:type="gramStart"/>
+      <w:r>
+        <w:t>cut</w:t>
+      </w:r>
+      <w:proofErr w:type="gramEnd"/>
+      <w:r>
+        <w:t xml:space="preserve"> corners</w:t>
+      </w:r>
+    </w:p>
+    <w:p>
+      <w:r>
+        <w:t>Correct Answer: (b) earned a lot of money</w:t>
+      </w:r>
+    </w:p>
+    <w:p>
+      <w:r>
+        <w:t>Explanation: “Make a pile” is an idiom meaning to earn a large amount of money. So (b) is correct.</w:t>
+      </w:r>
+    </w:p>
+    <w:p/>
+    <w:p>
+      <w:r>
+        <w:t>Question 303</w:t>
+      </w:r>
+    </w:p>
+    <w:p>
+      <w:r>
+        <w:t>Subject: English</w:t>
+      </w:r>
+    </w:p>
+    <w:p>
+      <w:r>
+        <w:t>Year: OAE generated questions</w:t>
+      </w:r>
+    </w:p>
+    <w:p>
+      <w:r>
+        <w:t>Instruction: From the words lettered A to D, choose the word that is most nearly similar in meaning to the underlined word.</w:t>
+      </w:r>
+    </w:p>
+    <w:p>
+      <w:r>
+        <w:t xml:space="preserve">Sentence: No wonder </w:t>
+      </w:r>
+      <w:proofErr w:type="spellStart"/>
+      <w:r>
+        <w:t>Dekemi</w:t>
+      </w:r>
+      <w:proofErr w:type="spellEnd"/>
+      <w:r>
+        <w:t xml:space="preserve"> later became a detective; she has been very observant.</w:t>
+      </w:r>
+    </w:p>
+    <w:p>
+      <w:r>
+        <w:t>Options:</w:t>
+      </w:r>
+    </w:p>
+    <w:p>
+      <w:r>
+        <w:t xml:space="preserve">(a) </w:t>
+      </w:r>
+      <w:proofErr w:type="gramStart"/>
+      <w:r>
+        <w:t>curious</w:t>
+      </w:r>
+      <w:proofErr w:type="gramEnd"/>
+    </w:p>
+    <w:p>
+      <w:r>
+        <w:t xml:space="preserve">(b) </w:t>
+      </w:r>
+      <w:proofErr w:type="gramStart"/>
+      <w:r>
+        <w:t>perceptive</w:t>
+      </w:r>
+      <w:proofErr w:type="gramEnd"/>
+    </w:p>
+    <w:p>
+      <w:r>
+        <w:t xml:space="preserve">(c) </w:t>
+      </w:r>
+      <w:proofErr w:type="gramStart"/>
+      <w:r>
+        <w:t>inductive</w:t>
+      </w:r>
+      <w:proofErr w:type="gramEnd"/>
+    </w:p>
+    <w:p>
+      <w:r>
+        <w:t xml:space="preserve">(d) </w:t>
+      </w:r>
+      <w:proofErr w:type="gramStart"/>
+      <w:r>
+        <w:t>inquisitive</w:t>
+      </w:r>
+      <w:proofErr w:type="gramEnd"/>
+    </w:p>
+    <w:p>
+      <w:r>
+        <w:t>Correct Answer: (b) perceptive</w:t>
+      </w:r>
+    </w:p>
+    <w:p>
+      <w:r>
+        <w:t>Explanation: “Observant” means quick to notice things; “perceptive” means having keen insight. The others are not exact synonyms. So (b) is correct.</w:t>
+      </w:r>
+    </w:p>
+    <w:p/>
+    <w:p>
+      <w:r>
+        <w:t>Question 304</w:t>
+      </w:r>
+    </w:p>
+    <w:p>
+      <w:r>
+        <w:t>Subject: English</w:t>
+      </w:r>
+    </w:p>
+    <w:p>
+      <w:r>
+        <w:t>Year: OAE generated questions</w:t>
+      </w:r>
+    </w:p>
+    <w:p>
+      <w:r>
+        <w:t>Instruction: From the words lettered A to D, choose the word that is most nearly similar in meaning to the underlined word.</w:t>
+      </w:r>
+    </w:p>
+    <w:p>
+      <w:r>
+        <w:t>Sentence: Nigeria has been playing a vital role in the political and economic development of Africa.</w:t>
+      </w:r>
+    </w:p>
+    <w:p>
+      <w:r>
+        <w:t>Options:</w:t>
+      </w:r>
+    </w:p>
+    <w:p>
+      <w:r>
+        <w:t xml:space="preserve">(a) </w:t>
+      </w:r>
+      <w:proofErr w:type="gramStart"/>
+      <w:r>
+        <w:t>creditable</w:t>
+      </w:r>
+      <w:proofErr w:type="gramEnd"/>
+    </w:p>
+    <w:p>
+      <w:r>
+        <w:t xml:space="preserve">(b) </w:t>
+      </w:r>
+      <w:proofErr w:type="gramStart"/>
+      <w:r>
+        <w:t>crucial</w:t>
+      </w:r>
+      <w:proofErr w:type="gramEnd"/>
+    </w:p>
+    <w:p>
+      <w:r>
+        <w:t xml:space="preserve">(c) </w:t>
+      </w:r>
+      <w:proofErr w:type="gramStart"/>
+      <w:r>
+        <w:t>respectable</w:t>
+      </w:r>
+      <w:proofErr w:type="gramEnd"/>
+    </w:p>
+    <w:p>
+      <w:r>
+        <w:t xml:space="preserve">(d) </w:t>
+      </w:r>
+      <w:proofErr w:type="gramStart"/>
+      <w:r>
+        <w:t>laudable</w:t>
+      </w:r>
+      <w:proofErr w:type="gramEnd"/>
+    </w:p>
+    <w:p>
+      <w:r>
+        <w:t>Correct Answer: (b) crucial</w:t>
+      </w:r>
+    </w:p>
+    <w:p>
+      <w:r>
+        <w:t>Explanation: “Vital” means extremely important; “crucial” means the same. The others mean praiseworthy or decent. So (b) is correct.</w:t>
+      </w:r>
+    </w:p>
+    <w:p/>
+    <w:p>
+      <w:r>
+        <w:t>Question 305</w:t>
+      </w:r>
+    </w:p>
+    <w:p>
+      <w:r>
+        <w:t>Subject: English</w:t>
+      </w:r>
+    </w:p>
+    <w:p>
+      <w:r>
+        <w:t>Year: OAE generated questions</w:t>
+      </w:r>
+    </w:p>
+    <w:p>
+      <w:r>
+        <w:t>Instruction: From the words lettered A to D, choose the word that is most nearly similar in meaning to the underlined word.</w:t>
+      </w:r>
+    </w:p>
+    <w:p>
+      <w:r>
+        <w:t xml:space="preserve">Sentence: </w:t>
+      </w:r>
+      <w:proofErr w:type="spellStart"/>
+      <w:r>
+        <w:t>Emeka's</w:t>
+      </w:r>
+      <w:proofErr w:type="spellEnd"/>
+      <w:r>
+        <w:t xml:space="preserve"> painting was so realistic that it could almost have been a photograph.</w:t>
+      </w:r>
+    </w:p>
+    <w:p>
+      <w:r>
+        <w:t>Options:</w:t>
+      </w:r>
+    </w:p>
+    <w:p>
+      <w:r>
+        <w:t xml:space="preserve">(a) </w:t>
+      </w:r>
+      <w:proofErr w:type="gramStart"/>
+      <w:r>
+        <w:t>picturesque</w:t>
+      </w:r>
+      <w:proofErr w:type="gramEnd"/>
+    </w:p>
+    <w:p>
+      <w:r>
+        <w:t xml:space="preserve">(b) </w:t>
+      </w:r>
+      <w:proofErr w:type="gramStart"/>
+      <w:r>
+        <w:t>concrete</w:t>
+      </w:r>
+      <w:proofErr w:type="gramEnd"/>
+    </w:p>
+    <w:p>
+      <w:r>
+        <w:t xml:space="preserve">(c) </w:t>
+      </w:r>
+      <w:proofErr w:type="gramStart"/>
+      <w:r>
+        <w:t>lively</w:t>
+      </w:r>
+      <w:proofErr w:type="gramEnd"/>
+    </w:p>
+    <w:p>
+      <w:r>
+        <w:t xml:space="preserve">(d) </w:t>
+      </w:r>
+      <w:proofErr w:type="gramStart"/>
+      <w:r>
+        <w:t>authentic</w:t>
+      </w:r>
+      <w:proofErr w:type="gramEnd"/>
+    </w:p>
+    <w:p>
+      <w:r>
+        <w:t>Correct Answer: (d) authentic</w:t>
+      </w:r>
+    </w:p>
+    <w:p>
+      <w:r>
+        <w:t>Explanation: “Realistic” means true to reality; “authentic” means genuine and real. “Picturesque” is visually pleasing; “concrete” is specific; “lively” is energetic. So (d) is correct.</w:t>
+      </w:r>
+    </w:p>
+    <w:p/>
+    <w:p>
+      <w:r>
+        <w:t>Question 306</w:t>
+      </w:r>
+    </w:p>
+    <w:p>
+      <w:r>
+        <w:t>Subject: English</w:t>
+      </w:r>
+    </w:p>
+    <w:p>
+      <w:r>
+        <w:t>Year: OAE generated questions</w:t>
+      </w:r>
+    </w:p>
+    <w:p>
+      <w:r>
+        <w:t>Instruction: From the words lettered A to D, choose the word that is most nearly similar in meaning to the underlined word.</w:t>
+      </w:r>
+    </w:p>
+    <w:p>
+      <w:r>
+        <w:t>Sentence: Courteously, Ade stood back to let his teacher go first through the door.</w:t>
+      </w:r>
+    </w:p>
+    <w:p>
+      <w:r>
+        <w:t>Options:</w:t>
+      </w:r>
+    </w:p>
+    <w:p>
+      <w:r>
+        <w:t>(a) Patiently</w:t>
+      </w:r>
+    </w:p>
+    <w:p>
+      <w:r>
+        <w:t>(b) Politely</w:t>
+      </w:r>
+    </w:p>
+    <w:p>
+      <w:r>
+        <w:t>(c) Carefully</w:t>
+      </w:r>
+    </w:p>
+    <w:p>
+      <w:r>
+        <w:t>(d) Calmly</w:t>
+      </w:r>
+    </w:p>
+    <w:p>
+      <w:r>
+        <w:t>Correct Answer: (b) Politely</w:t>
+      </w:r>
+    </w:p>
+    <w:p>
+      <w:r>
+        <w:t>Explanation: “Courteously” means with good manners; “politely” is the direct synonym. So (b) is correct.</w:t>
+      </w:r>
+    </w:p>
+    <w:p/>
+    <w:p>
+      <w:r>
+        <w:t>Question 307</w:t>
+      </w:r>
+    </w:p>
+    <w:p>
+      <w:r>
+        <w:t>Subject: English</w:t>
+      </w:r>
+    </w:p>
+    <w:p>
+      <w:r>
+        <w:t>Year: OAE generated questions</w:t>
+      </w:r>
+    </w:p>
+    <w:p>
+      <w:r>
+        <w:t>Instruction: From the words lettered A to D, choose the word that is most nearly similar in meaning to the underlined word.</w:t>
+      </w:r>
+    </w:p>
+    <w:p>
+      <w:r>
+        <w:t>Sentence: Many people used to live in poverty.</w:t>
+      </w:r>
+    </w:p>
+    <w:p>
+      <w:r>
+        <w:t>Options:</w:t>
+      </w:r>
+    </w:p>
+    <w:p>
+      <w:r>
+        <w:t xml:space="preserve">(a) </w:t>
+      </w:r>
+      <w:proofErr w:type="gramStart"/>
+      <w:r>
+        <w:t>instability</w:t>
+      </w:r>
+      <w:proofErr w:type="gramEnd"/>
+    </w:p>
+    <w:p>
+      <w:r>
+        <w:t xml:space="preserve">(b) </w:t>
+      </w:r>
+      <w:proofErr w:type="gramStart"/>
+      <w:r>
+        <w:t>want</w:t>
+      </w:r>
+      <w:proofErr w:type="gramEnd"/>
+    </w:p>
+    <w:p>
+      <w:r>
+        <w:t xml:space="preserve">(c) </w:t>
+      </w:r>
+      <w:proofErr w:type="gramStart"/>
+      <w:r>
+        <w:t>difficulty</w:t>
+      </w:r>
+      <w:proofErr w:type="gramEnd"/>
+    </w:p>
+    <w:p>
+      <w:r>
+        <w:t xml:space="preserve">(d) </w:t>
+      </w:r>
+      <w:proofErr w:type="gramStart"/>
+      <w:r>
+        <w:t>the</w:t>
+      </w:r>
+      <w:proofErr w:type="gramEnd"/>
+      <w:r>
+        <w:t xml:space="preserve"> slums</w:t>
+      </w:r>
+    </w:p>
+    <w:p>
+      <w:r>
+        <w:t>Correct Answer: (b) want</w:t>
+      </w:r>
+    </w:p>
+    <w:p>
+      <w:r>
+        <w:t>Explanation: “Poverty” means lack of basic necessities; “want” (as a noun) can mean the same. The others are not direct synonyms. So (b) is correct.</w:t>
+      </w:r>
+    </w:p>
+    <w:p/>
+    <w:p>
+      <w:r>
+        <w:t>Question 308</w:t>
+      </w:r>
+    </w:p>
+    <w:p>
+      <w:r>
+        <w:t>Subject: English</w:t>
+      </w:r>
+    </w:p>
+    <w:p>
+      <w:r>
+        <w:t>Year: OAE generated questions</w:t>
+      </w:r>
+    </w:p>
+    <w:p>
+      <w:r>
+        <w:t>Instruction: From the words lettered A to D, choose the word that is most nearly similar in meaning to the underlined word.</w:t>
+      </w:r>
+    </w:p>
+    <w:p>
+      <w:r>
+        <w:t xml:space="preserve">Sentence: The manager described </w:t>
+      </w:r>
+      <w:proofErr w:type="spellStart"/>
+      <w:r>
+        <w:t>Mfon</w:t>
+      </w:r>
+      <w:proofErr w:type="spellEnd"/>
+      <w:r>
+        <w:t xml:space="preserve"> as a man of vehement character.</w:t>
+      </w:r>
+    </w:p>
+    <w:p>
+      <w:r>
+        <w:t>Options:</w:t>
+      </w:r>
+    </w:p>
+    <w:p>
+      <w:r>
+        <w:t xml:space="preserve">(a) </w:t>
+      </w:r>
+      <w:proofErr w:type="gramStart"/>
+      <w:r>
+        <w:t>weak</w:t>
+      </w:r>
+      <w:proofErr w:type="gramEnd"/>
+      <w:r>
+        <w:t xml:space="preserve"> and uninterested</w:t>
+      </w:r>
+    </w:p>
+    <w:p>
+      <w:r>
+        <w:t xml:space="preserve">(b) </w:t>
+      </w:r>
+      <w:proofErr w:type="gramStart"/>
+      <w:r>
+        <w:t>strong</w:t>
+      </w:r>
+      <w:proofErr w:type="gramEnd"/>
+      <w:r>
+        <w:t xml:space="preserve"> and insistent</w:t>
+      </w:r>
+    </w:p>
+    <w:p>
+      <w:r>
+        <w:t xml:space="preserve">(c) </w:t>
+      </w:r>
+      <w:proofErr w:type="gramStart"/>
+      <w:r>
+        <w:t>troublesome</w:t>
+      </w:r>
+      <w:proofErr w:type="gramEnd"/>
+      <w:r>
+        <w:t xml:space="preserve"> and noisy</w:t>
+      </w:r>
+    </w:p>
+    <w:p>
+      <w:r>
+        <w:t xml:space="preserve">(d) </w:t>
+      </w:r>
+      <w:proofErr w:type="gramStart"/>
+      <w:r>
+        <w:t>clever</w:t>
+      </w:r>
+      <w:proofErr w:type="gramEnd"/>
+      <w:r>
+        <w:t xml:space="preserve"> and helpful</w:t>
+      </w:r>
+    </w:p>
+    <w:p>
+      <w:r>
+        <w:t>Correct Answer: (b) strong and insistent</w:t>
+      </w:r>
+    </w:p>
+    <w:p>
+      <w:r>
+        <w:t>Explanation: “Vehement” means showing strong feeling, forceful; “strong and insistent” matches. The others are either opposite or unrelated. So (b) is correct.</w:t>
+      </w:r>
+    </w:p>
     <w:p>
       <w:bookmarkStart w:id="0" w:name="_GoBack"/>
       <w:bookmarkEnd w:id="0"/>
     </w:p>
+    <w:p/>
+    <w:p/>
     <w:sectPr>
       <w:pgSz w:w="11906" w:h="16838"/>
       <w:pgMar w:top="1440" w:right="1440" w:bottom="1440" w:left="1440" w:header="708" w:footer="708" w:gutter="0"/>

</xml_diff>